<commit_message>
A1: correct Zenodo deposit reference v1.3 -> v1.4
Per current Zenodo state (10.5281/zenodo.19758429 deposited 2026-04-28
as "Sparse mFACEs + PTP/IEP classification of enteropancreatic
periprandial trajectories", Dataset/Open), update all v1.3 references
to v1.4 across:

- 04_manuscript/A1/manuscript.qmd (Methods + Data sharing)
- 04_manuscript/A1/cover_letter.md (Reproducibility)
- 04_manuscript/A1/numerical_ledger_A1.md (Identifiers table)
- 04_manuscript/lancet_de_A1_submission_package/ mirror copies
- 04_manuscript/lancet_de_A1_submission_package/README.md
- 04_manuscript/lancet_de_A1_submission_package/ZENODO_DEPOSIT_INSTRUCTIONS.md
- frozen date 2026-05-08 -> 2026-04-28

Re-render manuscript.docx + manuscript.pdf + cover_letter.docx;
repackage lancet_de_A1_submission_package.zip (1.5 MB).
</commit_message>
<xml_diff>
--- a/04_manuscript/A1/manuscript.docx
+++ b/04_manuscript/A1/manuscript.docx
@@ -1057,7 +1057,7 @@
         <w:t xml:space="preserve"> </w:t>
       </w:r>
       <w:r>
-        <w:t xml:space="preserve">v1·3) under CC-BY 4·0. Reporting follows STROBE for cohort studies</w:t>
+        <w:t xml:space="preserve">v1·4) under CC-BY 4·0. Reporting follows STROBE for cohort studies</w:t>
       </w:r>
       <w:r>
         <w:rPr>
@@ -2322,7 +2322,7 @@
         <w:t xml:space="preserve"> </w:t>
       </w:r>
       <w:r>
-        <w:t xml:space="preserve">v1·3 and subsequent branches) under CC-BY 4·0. The repository permits full reproduction of every numerical claim and follows FAIR data principles. Pre-registration is at the Open Science Framework (DOI 10.17605/OSF.IO/3CZRE; project at https://osf.io/tr469, frozen 2026-04-22).</w:t>
+        <w:t xml:space="preserve">v1·4 and subsequent branches) under CC-BY 4·0. The repository permits full reproduction of every numerical claim and follows FAIR data principles. Pre-registration is at the Open Science Framework (DOI 10.17605/OSF.IO/3CZRE; project at https://osf.io/tr469, frozen 2026-04-22).</w:t>
       </w:r>
     </w:p>
     <w:bookmarkEnd w:id="38"/>

</xml_diff>

<commit_message>
A1: post-deposit update with minted Zenodo DOI 10.5281/zenodo.20102979
</commit_message>
<xml_diff>
--- a/04_manuscript/A1/manuscript.docx
+++ b/04_manuscript/A1/manuscript.docx
@@ -1045,7 +1045,7 @@
         <w:t xml:space="preserve">02_code/10_A1_conceptual_figs.R</w:t>
       </w:r>
       <w:r>
-        <w:t xml:space="preserve">. All scripts and outputs are deposited at Zenodo (concept DOI 10.5281/zenodo.19743544) and on GitHub (</w:t>
+        <w:t xml:space="preserve">. All scripts and outputs are deposited at Zenodo (concept DOI 10.5281/zenodo.19743544; v3·0-A1 DOI 10.5281/zenodo.20102979) and on GitHub (</w:t>
       </w:r>
       <w:r>
         <w:rPr>
@@ -2310,7 +2310,7 @@
         <w:t xml:space="preserve">2829cd78018e411783671ec00f849647858bda552cfa4ec23ad505ba9704a117</w:t>
       </w:r>
       <w:r>
-        <w:t xml:space="preserve">), the 16-script analytic pipeline, the article-specific outputs, and the reproducibility scripts are deposited at Zenodo (concept DOI 10.5281/zenodo.19743544; article-specific version DOIs cited in each manuscript) and GitHub (</w:t>
+        <w:t xml:space="preserve">), the 16-script analytic pipeline, the article-specific outputs, and the reproducibility scripts are deposited at Zenodo (concept DOI 10.5281/zenodo.19743544; A1 v3·0-A1 DOI 10.5281/zenodo.20102979; A2 v2·0-A2 DOI 10.5281/zenodo.20102959) and GitHub (</w:t>
       </w:r>
       <w:r>
         <w:rPr>

</xml_diff>